<commit_message>
docs: Role.acesso no padrao ROLE_ do Spring Security e convencoes de nomes
- Documentacao, DER e diagrama de classes: role.nome -> role.acesso, com
  exemplos ROLE_ADMIN/ROLE_DELEGADO/ROLE_POLICIAL/ROLE_ESTAGIARIO
- CLAUDE.md: convencoes de nomes de sequence/FK/unique, camelCase com
  @Column, @NotNull em enum/relacionamento e uso de hasRole/hasAuthority

Co-Authored-By: Claude Opus 5.5 <noreply@anthropic.com>
Claude-Session: https://claude.ai/code/session_01GMFoBKNCA64LGtSS3QvF5S
</commit_message>
<xml_diff>
--- a/docs/Sistema_Delegacia_v2_Documentacao_SGI-DP.docx
+++ b/docs/Sistema_Delegacia_v2_Documentacao_SGI-DP.docx
@@ -4570,7 +4570,7 @@
           <w:vertAlign w:val="baseline"/>
           <w:rtl w:val="0"/>
         </w:rPr>
-        <w:t xml:space="preserve"> atributo Role.nome permanece como varchar livre (sem enum), pois representa um </w:t>
+        <w:t xml:space="preserve"> atributo Role.acesso permanece como varchar livre (sem enum), pois representa um </w:t>
       </w:r>
       <w:r>
         <w:rPr>
@@ -4674,7 +4674,7 @@
           <w:vertAlign w:val="baseline"/>
           <w:rtl w:val="0"/>
         </w:rPr>
-        <w:t xml:space="preserve"> Java.</w:t>
+        <w:t xml:space="preserve"> Java. Os valores de acesso seguem a convenção do Spring Security, com prefixo ROLE_ (ex.: ROLE_ADMIN, ROLE_DELEGADO, ROLE_POLICIAL, ROLE_ESTAGIARIO), e a própria entidade Role implementa GrantedAuthority, devolvendo esse valor em getAuthority().</w:t>
       </w:r>
       <w:r>
         <w:rPr>
@@ -5320,7 +5320,7 @@
                 <w:szCs w:val="19"/>
                 <w:rtl w:val="0"/>
               </w:rPr>
-              <w:t xml:space="preserve">Token deve conter papel (role) do usuario para autorizacao.</w:t>
+              <w:t xml:space="preserve">Token deve conter o papel do usuario (authority no formato ROLE_*, ex.: ROLE_POLICIAL) para autorizacao.</w:t>
             </w:r>
             <w:r>
               <w:rPr>
@@ -19080,7 +19080,7 @@
           <w:szCs w:val="24"/>
           <w:rtl w:val="0"/>
         </w:rPr>
-        <w:t xml:space="preserve">O modelo de domínio representa as entidades de negócio e seus relacionamentos, servindo de base direta para o mapeamento JPA. As enumerações (papeis de autorização, status) são mostradas em itálico dentro de cada classe. A autorização por papel e modelada através da entidade Role (catalogo extensivel de papeis, sem enum fixo), associada a Usuario por uma relacao N:1 direta - muitos usuários para um papel -, sem necessidade de tabela de junção, já que cada usuário possui exatamente um papel ativo por vez.</w:t>
+        <w:t xml:space="preserve">O modelo de domínio representa as entidades de negócio e seus relacionamentos, servindo de base direta para o mapeamento JPA. As enumerações (papeis de autorização, status) são mostradas em itálico dentro de cada classe. A autorização por papel e modelada através da entidade Role (catalogo extensivel de papeis, sem enum fixo, cujo atributo acesso guarda a authority no padrao do Spring Security, ex.: ROLE_ADMIN), associada a Usuario por uma relacao N:1 direta - muitos usuários para um papel -, sem necessidade de tabela de junção, já que cada usuário possui exatamente um papel ativo por vez.</w:t>
       </w:r>
     </w:p>
     <w:p>
@@ -19206,7 +19206,7 @@
           <w:szCs w:val="24"/>
           <w:rtl w:val="0"/>
         </w:rPr>
-        <w:t xml:space="preserve">O MER espelha o diagrama de classes no "sotaque" de banco de dados relacional, com chaves primárias, chaves estrangeiras, constraints de unicidade e regras de integridade referencial explícitas. Note que role.nome recebe UNIQUE (nao ha dois papeis com o mesmo nome), enquanto matrícula e login em usuário também são UNIQUE por serem identificadores administrativo e de acesso, respectivamente. As entidades veiculo e historico_situacao_veiculo foram incorporadas ao modelo para dar suporte ao controle de veículos apreendidos, com rastreabilidade de mudanças de situação (na DEPOL, em pátio, devolvido, descartado) via histórico dedicado, seguindo o mesmo padrão de auditoria já usado em historico_status_procedimento. Em procedimento, a unicidade é composta por (tipo, numero, ano), pois cada tipo de procedimento (IP, TOC, AIAI, AIFAI) possui numeração própria, que reinicia a cada ano e pode coincidir entre tipos. Em oitiva, responsavel_id indica o servidor que conduz a oitiva (e que recebe a notificação de oitiva próxima), enquanto cadastrado_por_id e data_cadastro registram a autoria do agendamento. O lacre do veículo é gerado automaticamente pela camada de serviço no formato LAC-AAAA-NNNNNN (ano corrente + sequencial de seis dígitos obtido de uma sequence dedicada do banco), garantindo a unicidade exigida pela constraint. </w:t>
+        <w:t xml:space="preserve">O MER espelha o diagrama de classes no "sotaque" de banco de dados relacional, com chaves primárias, chaves estrangeiras, constraints de unicidade e regras de integridade referencial explícitas. Note que role.acesso recebe UNIQUE (nao ha dois papeis com a mesma authority, ex.: ROLE_ADMIN), enquanto matrícula e login em usuário também são UNIQUE por serem identificadores administrativo e de acesso, respectivamente. As entidades veiculo e historico_situacao_veiculo foram incorporadas ao modelo para dar suporte ao controle de veículos apreendidos, com rastreabilidade de mudanças de situação (na DEPOL, em pátio, devolvido, descartado) via histórico dedicado, seguindo o mesmo padrão de auditoria já usado em historico_status_procedimento. Em procedimento, a unicidade é composta por (tipo, numero, ano), pois cada tipo de procedimento (IP, TOC, AIAI, AIFAI) possui numeração própria, que reinicia a cada ano e pode coincidir entre tipos. Em oitiva, responsavel_id indica o servidor que conduz a oitiva (e que recebe a notificação de oitiva próxima), enquanto cadastrado_por_id e data_cadastro registram a autoria do agendamento. O lacre do veículo é gerado automaticamente pela camada de serviço no formato LAC-AAAA-NNNNNN (ano corrente + sequencial de seis dígitos obtido de uma sequence dedicada do banco), garantindo a unicidade exigida pela constraint. </w:t>
       </w:r>
       <w:r>
         <w:rPr/>

</xml_diff>

<commit_message>
docs: novos tipos de procedimento e numero como Long/bigint
- TipoProcedimento: BO, IP, TCO, APF, AIAI, AAFAI, ROP (doc, DER, classes)
- procedimento.numero passa a bigint (Long), com justificativa na secao 7
- CLAUDE.md atualizado

Co-Authored-By: Claude Opus 5.5 <noreply@anthropic.com>
Claude-Session: https://claude.ai/code/session_01GMFoBKNCA64LGtSS3QvF5S
</commit_message>
<xml_diff>
--- a/docs/Sistema_Delegacia_v2_Documentacao_SGI-DP.docx
+++ b/docs/Sistema_Delegacia_v2_Documentacao_SGI-DP.docx
@@ -4466,7 +4466,7 @@
           <w:vertAlign w:val="baseline"/>
           <w:rtl w:val="0"/>
         </w:rPr>
-        <w:t xml:space="preserve"> de estado fechado e governado por regra de negocio no codigo (StatusUsuario [PENDENTE, APROVADO, REJEITADO, DESATIVADO], TipoProcedimento [IP, TOC, AIAI, AIFAI], StatusProcedimento, StatusOitiva, StatusRepasse, OrigemCustodia, TipoParte, TipoNotificacao, SituacaoVeiculo, Pericia) sao mapeadas com @Enumerated(EnumType.STRING), gravando o nome do valor (ex.: "PENDENTE") em vez do </w:t>
+        <w:t xml:space="preserve"> de estado fechado e governado por regra de negocio no codigo (StatusUsuario [PENDENTE, APROVADO, REJEITADO, DESATIVADO], TipoProcedimento [BO, IP, TCO, APF, AIAI, AAFAI, ROP], StatusProcedimento, StatusOitiva, StatusRepasse, OrigemCustodia, TipoParte, TipoNotificacao, SituacaoVeiculo, Pericia) sao mapeadas com @Enumerated(EnumType.STRING), gravando o nome do valor (ex.: "PENDENTE") em vez do </w:t>
       </w:r>
       <w:r>
         <w:rPr>
@@ -6904,7 +6904,7 @@
                 <w:szCs w:val="19"/>
                 <w:rtl w:val="0"/>
               </w:rPr>
-              <w:t xml:space="preserve">O sistema deve permitir que Delegado/Policial cadastre um novo procedimento, com tipo (IP, TOC, AIAI, AIFAI), numero, ano, crime, data de abertura.</w:t>
+              <w:t xml:space="preserve">O sistema deve permitir que Delegado/Policial cadastre um novo procedimento, com tipo (BO, IP, TCO, APF, AIAI, AAFAI, ROP), numero, ano, crime, data de abertura.</w:t>
             </w:r>
             <w:r>
               <w:rPr>
@@ -19206,7 +19206,7 @@
           <w:szCs w:val="24"/>
           <w:rtl w:val="0"/>
         </w:rPr>
-        <w:t xml:space="preserve">O MER espelha o diagrama de classes no "sotaque" de banco de dados relacional, com chaves primárias, chaves estrangeiras, constraints de unicidade e regras de integridade referencial explícitas. Note que role.acesso recebe UNIQUE (nao ha dois papeis com a mesma authority, ex.: ROLE_ADMIN), enquanto matrícula e login em usuário também são UNIQUE por serem identificadores administrativo e de acesso, respectivamente. As entidades veiculo e historico_situacao_veiculo foram incorporadas ao modelo para dar suporte ao controle de veículos apreendidos, com rastreabilidade de mudanças de situação (na DEPOL, em pátio, devolvido, descartado) via histórico dedicado, seguindo o mesmo padrão de auditoria já usado em historico_status_procedimento. Em procedimento, a unicidade é composta por (tipo, numero, ano), pois cada tipo de procedimento (IP, TOC, AIAI, AIFAI) possui numeração própria, que reinicia a cada ano e pode coincidir entre tipos. Em oitiva, responsavel_id indica o servidor que conduz a oitiva (e que recebe a notificação de oitiva próxima), enquanto cadastrado_por_id e data_cadastro registram a autoria do agendamento. O lacre do veículo é gerado automaticamente pela camada de serviço no formato LAC-AAAA-NNNNNN (ano corrente + sequencial de seis dígitos obtido de uma sequence dedicada do banco), garantindo a unicidade exigida pela constraint. </w:t>
+        <w:t xml:space="preserve">O MER espelha o diagrama de classes no "sotaque" de banco de dados relacional, com chaves primárias, chaves estrangeiras, constraints de unicidade e regras de integridade referencial explícitas. Note que role.acesso recebe UNIQUE (nao ha dois papeis com a mesma authority, ex.: ROLE_ADMIN), enquanto matrícula e login em usuário também são UNIQUE por serem identificadores administrativo e de acesso, respectivamente. As entidades veiculo e historico_situacao_veiculo foram incorporadas ao modelo para dar suporte ao controle de veículos apreendidos, com rastreabilidade de mudanças de situação (na DEPOL, em pátio, devolvido, descartado) via histórico dedicado, seguindo o mesmo padrão de auditoria já usado em historico_status_procedimento. Em procedimento, a unicidade é composta por (tipo, numero, ano), pois cada tipo de procedimento (BO - Boletim de Ocorrência, IP - Inquérito Policial, TCO - Termo Circunstanciado de Ocorrência, APF - Auto de Prisão em Flagrante, AIAI - Auto de Investigação de Ato Infracional, AAFAI - Auto de Apreensão em Flagrante de Ato Infracional, ROP - Registro de Ocorrência Policial da PM) possui numeração própria, que reinicia a cada ano e pode coincidir entre tipos. O número é armazenado como valor numérico (bigint), o que garante ordenação correta e evita duplicidades causadas por zeros à esquerda; a formatação para exibição fica a cargo da interface. Em oitiva, responsavel_id indica o servidor que conduz a oitiva (e que recebe a notificação de oitiva próxima), enquanto cadastrado_por_id e data_cadastro registram a autoria do agendamento. O lacre do veículo é gerado automaticamente pela camada de serviço no formato LAC-AAAA-NNNNNN (ano corrente + sequencial de seis dígitos obtido de uma sequence dedicada do banco), garantindo a unicidade exigida pela constraint. </w:t>
       </w:r>
       <w:r>
         <w:rPr/>

</xml_diff>

<commit_message>
docs: StatusOitiva com DESMARCADA e remarcacao como edicao de data
- RF07, RF08, UC05, UC06 e regras de acesso: cancelar -> desmarcar;
  remarcar mantem status AGENDADA
- Figura 1 (casos de uso de oitivas) redesenhada; DER e classes atualizados
- CLAUDE.md com as regras de oitiva

Co-Authored-By: Claude Opus 5.5 <noreply@anthropic.com>
Claude-Session: https://claude.ai/code/session_01GMFoBKNCA64LGtSS3QvF5S
</commit_message>
<xml_diff>
--- a/docs/Sistema_Delegacia_v2_Documentacao_SGI-DP.docx
+++ b/docs/Sistema_Delegacia_v2_Documentacao_SGI-DP.docx
@@ -3767,7 +3767,7 @@
           <w:vertAlign w:val="baseline"/>
           <w:rtl w:val="0"/>
         </w:rPr>
-        <w:t xml:space="preserve">Oitivas (criar/editar/cancelar): Delegado/Policial.</w:t>
+        <w:t xml:space="preserve">Oitivas (criar/editar/desmarcar): Delegado/Policial.</w:t>
       </w:r>
       <w:r>
         <w:rPr>
@@ -6346,7 +6346,7 @@
                 <w:szCs w:val="19"/>
                 <w:rtl w:val="0"/>
               </w:rPr>
-              <w:t xml:space="preserve">O sistema deve permitir que Delegado/Policial altere data, hora ou status de uma oitiva ja agendada.</w:t>
+              <w:t xml:space="preserve">O sistema deve permitir que Delegado/Policial altere data e hora (remarcacao) ou status de uma oitiva ja agendada.</w:t>
             </w:r>
             <w:r>
               <w:rPr>
@@ -6436,7 +6436,7 @@
                 <w:szCs w:val="19"/>
                 <w:rtl w:val="0"/>
               </w:rPr>
-              <w:t xml:space="preserve">Nao e possivel editar oitiva ja concluida/cancelada.</w:t>
+              <w:t xml:space="preserve">Nao e possivel editar oitiva ja concluida/desmarcada. Remarcar (alterar data/hora) mantem o status AGENDADA.</w:t>
             </w:r>
             <w:r>
               <w:rPr>
@@ -6502,37 +6502,37 @@
                 <w:szCs w:val="19"/>
                 <w:rtl w:val="0"/>
               </w:rPr>
-              <w:t xml:space="preserve">Cancelar oitiva</w:t>
-            </w:r>
-            <w:r>
-              <w:rPr>
-                <w:rtl w:val="0"/>
-              </w:rPr>
-            </w:r>
-          </w:p>
-        </w:tc>
-        <w:tc>
-          <w:tcPr>
-            <w:tcMar>
-              <w:top w:w="80.0" w:type="dxa"/>
-              <w:left w:w="100.0" w:type="dxa"/>
-              <w:bottom w:w="80.0" w:type="dxa"/>
-              <w:right w:w="100.0" w:type="dxa"/>
-            </w:tcMar>
-          </w:tcPr>
-          <w:p>
-            <w:pPr>
-              <w:rPr/>
-            </w:pPr>
-            <w:r>
-              <w:rPr>
-                <w:b w:val="0"/>
-                <w:bCs w:val="0"/>
-                <w:sz w:val="19"/>
-                <w:szCs w:val="19"/>
-                <w:rtl w:val="0"/>
-              </w:rPr>
-              <w:t xml:space="preserve">O sistema deve permitir que Delegado/Policial cancele uma oitiva agendada, exigindo motivo.</w:t>
+              <w:t xml:space="preserve">Desmarcar oitiva</w:t>
+            </w:r>
+            <w:r>
+              <w:rPr>
+                <w:rtl w:val="0"/>
+              </w:rPr>
+            </w:r>
+          </w:p>
+        </w:tc>
+        <w:tc>
+          <w:tcPr>
+            <w:tcMar>
+              <w:top w:w="80.0" w:type="dxa"/>
+              <w:left w:w="100.0" w:type="dxa"/>
+              <w:bottom w:w="80.0" w:type="dxa"/>
+              <w:right w:w="100.0" w:type="dxa"/>
+            </w:tcMar>
+          </w:tcPr>
+          <w:p>
+            <w:pPr>
+              <w:rPr/>
+            </w:pPr>
+            <w:r>
+              <w:rPr>
+                <w:b w:val="0"/>
+                <w:bCs w:val="0"/>
+                <w:sz w:val="19"/>
+                <w:szCs w:val="19"/>
+                <w:rtl w:val="0"/>
+              </w:rPr>
+              <w:t xml:space="preserve">O sistema deve permitir que Delegado/Policial desmarque uma oitiva agendada, exigindo motivo.</w:t>
             </w:r>
             <w:r>
               <w:rPr>
@@ -14001,7 +14001,7 @@
           <w:color w:val="000000"/>
           <w:rtl w:val="0"/>
         </w:rPr>
-        <w:t xml:space="preserve">UC05 - Editar/Cancelar Oitiva (RF07, RF08)</w:t>
+        <w:t xml:space="preserve">UC05 - Editar/Remarcar ou Desmarcar Oitiva (RF07, RF08)</w:t>
       </w:r>
     </w:p>
     <w:p>
@@ -14149,7 +14149,7 @@
           <w:vertAlign w:val="baseline"/>
           <w:rtl w:val="0"/>
         </w:rPr>
-        <w:t xml:space="preserve">Usuario altera data/hora/status.</w:t>
+        <w:t xml:space="preserve">Usuario altera data/hora (remarcacao) ou status; na remarcacao a oitiva permanece com status "agendada".</w:t>
       </w:r>
       <w:r>
         <w:rPr>
@@ -14262,7 +14262,7 @@
           <w:vertAlign w:val="baseline"/>
           <w:rtl w:val="0"/>
         </w:rPr>
-        <w:t xml:space="preserve">Usuario escolhe "Cancelar" em vez de editar.</w:t>
+        <w:t xml:space="preserve">Usuario escolhe "Desmarcar" em vez de editar.</w:t>
       </w:r>
       <w:r>
         <w:rPr>
@@ -14309,7 +14309,7 @@
           <w:vertAlign w:val="baseline"/>
           <w:rtl w:val="0"/>
         </w:rPr>
-        <w:t xml:space="preserve">Sistema exige justificativa de cancelamento.</w:t>
+        <w:t xml:space="preserve">Sistema exige justificativa da desmarcacao.</w:t>
       </w:r>
       <w:r>
         <w:rPr>
@@ -14356,7 +14356,7 @@
           <w:vertAlign w:val="baseline"/>
           <w:rtl w:val="0"/>
         </w:rPr>
-        <w:t xml:space="preserve">Sistema atualiza status para "cancelada".</w:t>
+        <w:t xml:space="preserve">Sistema atualiza status para "desmarcada".</w:t>
       </w:r>
       <w:r>
         <w:rPr>
@@ -14422,7 +14422,7 @@
           <w:vertAlign w:val="baseline"/>
           <w:rtl w:val="0"/>
         </w:rPr>
-        <w:t xml:space="preserve">Oitiva ja esta "concluida" ou "cancelada": sistema bloqueia edicao/cancelamento.</w:t>
+        <w:t xml:space="preserve">Oitiva ja esta "concluida" ou "desmarcada": sistema bloqueia edicao/desmarcacao.</w:t>
       </w:r>
       <w:r>
         <w:rPr>
@@ -14447,7 +14447,7 @@
         <w:rPr>
           <w:rtl w:val="0"/>
         </w:rPr>
-        <w:t xml:space="preserve">Oitiva atualizada (editada ou cancelada) ou operacao bloqueada.</w:t>
+        <w:t xml:space="preserve">Oitiva atualizada (editada/remarcada ou desmarcada) ou operacao bloqueada.</w:t>
       </w:r>
     </w:p>
     <w:p>
@@ -14683,7 +14683,7 @@
         <w:rPr>
           <w:rtl w:val="0"/>
         </w:rPr>
-        <w:t xml:space="preserve">Nenhuma alteracao de estado; apenas exibicao. Para o Estagiario, a interface nao exibe opcoes de criar/editar/cancelar - restricao validada tanto no frontend quanto no backend.</w:t>
+        <w:t xml:space="preserve">Nenhuma alteracao de estado; apenas exibicao. Para o Estagiario, a interface nao exibe opcoes de criar/editar/desmarcar - restricao validada tanto no frontend quanto no backend.</w:t>
       </w:r>
     </w:p>
     <w:p>
@@ -18442,7 +18442,7 @@
         <w:rPr/>
         <w:drawing>
           <wp:inline distB="0" distT="0" distL="0" distR="0">
-            <wp:extent cx="4685164" cy="2892853"/>
+            <wp:extent cx="4685164" cy="3118849"/>
             <wp:effectExtent b="0" l="0" r="0" t="0"/>
             <wp:docPr id="24" name="image3.png"/>
             <a:graphic>
@@ -18462,7 +18462,7 @@
                   <pic:spPr>
                     <a:xfrm>
                       <a:off x="0" y="0"/>
-                      <a:ext cx="4685164" cy="2892853"/>
+                      <a:ext cx="4685164" cy="3118849"/>
                     </a:xfrm>
                     <a:prstGeom prst="rect"/>
                     <a:ln/>

</xml_diff>

<commit_message>
docs: tipos de notificacao e referencia_id
- TipoNotificacao definido (OITIVA_PROXIMA, REPASSE_RECEBIDO, REPASSE_ACEITO,
  REPASSE_RECUSADO, CADASTRO_PENDENTE) na doc, DER e classes
- notificacao.referencia_id (sem FK) e indice (usuario_destinatario_id, lida)
- UC15, secao 7 e CLAUDE.md atualizados

Co-Authored-By: Claude Opus 5.5 <noreply@anthropic.com>
Claude-Session: https://claude.ai/code/session_01GMFoBKNCA64LGtSS3QvF5S
</commit_message>
<xml_diff>
--- a/docs/Sistema_Delegacia_v2_Documentacao_SGI-DP.docx
+++ b/docs/Sistema_Delegacia_v2_Documentacao_SGI-DP.docx
@@ -4466,7 +4466,7 @@
           <w:vertAlign w:val="baseline"/>
           <w:rtl w:val="0"/>
         </w:rPr>
-        <w:t xml:space="preserve"> de estado fechado e governado por regra de negocio no codigo (StatusUsuario [PENDENTE, APROVADO, REJEITADO, DESATIVADO], TipoProcedimento [BO, IP, TCO, APF, AIAI, AAFAI, ROP], StatusProcedimento, StatusOitiva, StatusRepasse, OrigemCustodia, TipoParte, TipoNotificacao, SituacaoVeiculo, Pericia) sao mapeadas com @Enumerated(EnumType.STRING), gravando o nome do valor (ex.: "PENDENTE") em vez do </w:t>
+        <w:t xml:space="preserve"> de estado fechado e governado por regra de negocio no codigo (StatusUsuario [PENDENTE, APROVADO, REJEITADO, DESATIVADO], TipoProcedimento [BO, IP, TCO, APF, AIAI, AAFAI, ROP], StatusProcedimento, StatusOitiva, StatusRepasse, OrigemCustodia, TipoParte, TipoNotificacao [OITIVA_PROXIMA, REPASSE_RECEBIDO, REPASSE_ACEITO, REPASSE_RECUSADO, CADASTRO_PENDENTE], SituacaoVeiculo, Pericia) sao mapeadas com @Enumerated(EnumType.STRING), gravando o nome do valor (ex.: "PENDENTE") em vez do </w:t>
       </w:r>
       <w:r>
         <w:rPr>
@@ -18301,7 +18301,7 @@
         <w:rPr>
           <w:rtl w:val="0"/>
         </w:rPr>
-        <w:t xml:space="preserve">Sistema gera notificacao automatica (oitiva proxima, repasse recebido, repasse respondido) exibida no cabecalho. Nao ha interacao direta do usuario para disparar - e evento de sistema; usuario apenas visualiza ou marca como lida.</w:t>
+        <w:t xml:space="preserve">Sistema gera notificacao automatica (oitiva proxima, repasse recebido, repasse aceito/recusado, cadastro pendente para o Admin) exibida no cabecalho. Cada notificacao guarda a referencia ao registro de origem (oitiva, repasse ou usuario), usada para abrir a tela correspondente e para nao repetir a notificacao de oitiva proxima. Nao ha interacao direta do usuario para disparar - e evento de sistema; usuario apenas visualiza ou marca como lida.</w:t>
       </w:r>
     </w:p>
     <w:p>
@@ -19093,7 +19093,7 @@
         <w:rPr/>
         <w:drawing>
           <wp:inline distB="0" distT="0" distL="0" distR="0">
-            <wp:extent cx="5731510" cy="3788850"/>
+            <wp:extent cx="5731510" cy="3966659"/>
             <wp:effectExtent b="0" l="0" r="0" t="0"/>
             <wp:docPr id="27" name="image9.png"/>
             <a:graphic>
@@ -19113,7 +19113,7 @@
                   <pic:spPr>
                     <a:xfrm>
                       <a:off x="0" y="0"/>
-                      <a:ext cx="5731510" cy="3788850"/>
+                      <a:ext cx="5731510" cy="3966659"/>
                     </a:xfrm>
                     <a:prstGeom prst="rect"/>
                     <a:ln/>
@@ -19206,13 +19206,13 @@
           <w:szCs w:val="24"/>
           <w:rtl w:val="0"/>
         </w:rPr>
-        <w:t xml:space="preserve">O MER espelha o diagrama de classes no "sotaque" de banco de dados relacional, com chaves primárias, chaves estrangeiras, constraints de unicidade e regras de integridade referencial explícitas. Note que role.acesso recebe UNIQUE (nao ha dois papeis com a mesma authority, ex.: ROLE_ADMIN), enquanto matrícula e login em usuário também são UNIQUE por serem identificadores administrativo e de acesso, respectivamente. As entidades veiculo e historico_situacao_veiculo foram incorporadas ao modelo para dar suporte ao controle de veículos apreendidos, com rastreabilidade de mudanças de situação (na DEPOL, em pátio, devolvido, descartado) via histórico dedicado, seguindo o mesmo padrão de auditoria já usado em historico_status_procedimento. Em procedimento, a unicidade é composta por (tipo, numero, ano), pois cada tipo de procedimento (BO - Boletim de Ocorrência, IP - Inquérito Policial, TCO - Termo Circunstanciado de Ocorrência, APF - Auto de Prisão em Flagrante, AIAI - Auto de Investigação de Ato Infracional, AAFAI - Auto de Apreensão em Flagrante de Ato Infracional, ROP - Registro de Ocorrência Policial da PM) possui numeração própria, que reinicia a cada ano e pode coincidir entre tipos. O número é armazenado como valor numérico (bigint), o que garante ordenação correta e evita duplicidades causadas por zeros à esquerda; a formatação para exibição fica a cargo da interface. Em oitiva, responsavel_id indica o servidor que conduz a oitiva (e que recebe a notificação de oitiva próxima), enquanto cadastrado_por_id e data_cadastro registram a autoria do agendamento. O lacre do veículo é gerado automaticamente pela camada de serviço no formato LAC-AAAA-NNNNNN (ano corrente + sequencial de seis dígitos obtido de uma sequence dedicada do banco), garantindo a unicidade exigida pela constraint. </w:t>
+        <w:t xml:space="preserve">O MER espelha o diagrama de classes no "sotaque" de banco de dados relacional, com chaves primárias, chaves estrangeiras, constraints de unicidade e regras de integridade referencial explícitas. Note que role.acesso recebe UNIQUE (nao ha dois papeis com a mesma authority, ex.: ROLE_ADMIN), enquanto matrícula e login em usuário também são UNIQUE por serem identificadores administrativo e de acesso, respectivamente. As entidades veiculo e historico_situacao_veiculo foram incorporadas ao modelo para dar suporte ao controle de veículos apreendidos, com rastreabilidade de mudanças de situação (na DEPOL, em pátio, devolvido, descartado) via histórico dedicado, seguindo o mesmo padrão de auditoria já usado em historico_status_procedimento. Em procedimento, a unicidade é composta por (tipo, numero, ano), pois cada tipo de procedimento (BO - Boletim de Ocorrência, IP - Inquérito Policial, TCO - Termo Circunstanciado de Ocorrência, APF - Auto de Prisão em Flagrante, AIAI - Auto de Investigação de Ato Infracional, AAFAI - Auto de Apreensão em Flagrante de Ato Infracional, ROP - Registro de Ocorrência Policial da PM) possui numeração própria, que reinicia a cada ano e pode coincidir entre tipos. O número é armazenado como valor numérico (bigint), o que garante ordenação correta e evita duplicidades causadas por zeros à esquerda; a formatação para exibição fica a cargo da interface. Em oitiva, responsavel_id indica o servidor que conduz a oitiva (e que recebe a notificação de oitiva próxima), enquanto cadastrado_por_id e data_cadastro registram a autoria do agendamento. O lacre do veículo é gerado automaticamente pela camada de serviço no formato LAC-AAAA-NNNNNN (ano corrente + sequencial de seis dígitos obtido de uma sequence dedicada do banco), garantindo a unicidade exigida pela constraint. Em notificacao, referencia_id guarda o id do registro que originou o aviso, cuja tabela é determinada pelo tipo (OITIVA_PROXIMA aponta para oitiva; REPASSE_RECEBIDO, REPASSE_ACEITO e REPASSE_RECUSADO para repasse; CADASTRO_PENDENTE para usuario); por apontar para tabelas diferentes, não possui chave estrangeira. O índice (usuario_destinatario_id, lida) acelera a consulta de notificações não lidas exibidas no cabeçalho. </w:t>
       </w:r>
       <w:r>
         <w:rPr/>
         <w:drawing>
           <wp:inline distB="0" distT="0" distL="0" distR="0">
-            <wp:extent cx="5731510" cy="3966659"/>
+            <wp:extent cx="5731510" cy="4085829"/>
             <wp:effectExtent b="0" l="0" r="0" t="0"/>
             <wp:docPr id="30" name="image7.png"/>
             <a:graphic>
@@ -19232,7 +19232,7 @@
                   <pic:spPr>
                     <a:xfrm>
                       <a:off x="0" y="0"/>
-                      <a:ext cx="5731510" cy="3966659"/>
+                      <a:ext cx="5731510" cy="4085829"/>
                     </a:xfrm>
                     <a:prstGeom prst="rect"/>
                     <a:ln/>

</xml_diff>

<commit_message>
docs: fecha documentacao com o modelo final das 11 entidades JPA
- Diagrama de classes com os nomes reais dos atributos Java e metodos de dominio
- DER: veiculo sem localizacao_patio, motor nullable, enums StatusPericia e
  OrigemHistoricoCustodia, sequence do lacre
- Doc: RF24/RF25/RF26, UC19 e UC21 sem localizacao no patio; enums da secao 1.7
- CLAUDE.md: tabela de dominio final, lacre via schema.sql, fluxo do aceite de repasse

Co-Authored-By: Claude Opus 5.5 <noreply@anthropic.com>
Claude-Session: https://claude.ai/code/session_01GMFoBKNCA64LGtSS3QvF5S
</commit_message>
<xml_diff>
--- a/docs/Sistema_Delegacia_v2_Documentacao_SGI-DP.docx
+++ b/docs/Sistema_Delegacia_v2_Documentacao_SGI-DP.docx
@@ -4466,7 +4466,7 @@
           <w:vertAlign w:val="baseline"/>
           <w:rtl w:val="0"/>
         </w:rPr>
-        <w:t xml:space="preserve"> de estado fechado e governado por regra de negocio no codigo (StatusUsuario [PENDENTE, APROVADO, REJEITADO, DESATIVADO], TipoProcedimento [BO, IP, TCO, APF, AIAI, AAFAI, ROP], StatusProcedimento, StatusOitiva, StatusRepasse, OrigemCustodia, TipoParte, TipoNotificacao [OITIVA_PROXIMA, REPASSE_RECEBIDO, REPASSE_ACEITO, REPASSE_RECUSADO, CADASTRO_PENDENTE], SituacaoVeiculo, Pericia) sao mapeadas com @Enumerated(EnumType.STRING), gravando o nome do valor (ex.: "PENDENTE") em vez do </w:t>
+        <w:t xml:space="preserve"> de estado fechado e governado por regra de negocio no codigo (StatusUsuario [PENDENTE, APROVADO, REJEITADO, DESATIVADO], TipoProcedimento [BO, IP, TCO, APF, AIAI, AAFAI, ROP], StatusProcedimento, StatusOitiva, StatusRepasse, OrigemHistoricoCustodia, TipoParte, TipoNotificacao [OITIVA_PROXIMA, REPASSE_RECEBIDO, REPASSE_ACEITO, REPASSE_RECUSADO, CADASTRO_PENDENTE], SituacaoVeiculo, StatusPericia) sao mapeadas com @Enumerated(EnumType.STRING), gravando o nome do valor (ex.: "PENDENTE") em vez do </w:t>
       </w:r>
       <w:r>
         <w:rPr>
@@ -9598,7 +9598,7 @@
                 <w:szCs w:val="19"/>
                 <w:rtl w:val="0"/>
               </w:rPr>
-              <w:t xml:space="preserve">Lacre gerado automaticamente (LAC-AAAA-NNNNNN) e unico; placa e chassi sao opcionais (veiculo pode estar sem placa ou com identificacao adulterada); situacao inicial NA_DEPOL (veiculo na delegacia, antes de eventual remocao ao patio).</w:t>
+              <w:t xml:space="preserve">Lacre gerado automaticamente (LAC-AAAA-NNNNNN) e unico; placa e chassi sao opcionais (veiculo pode estar sem placa ou com identificacao adulterada); situacao inicial NA_DEPOL (veiculo na delegacia, antes de eventual remocao ao patio). O lacre usa uma sequence dedicada do banco (seq_lacre_veiculo), criada via script schema.sql por nao estar associada a um id de entidade.</w:t>
             </w:r>
             <w:r>
               <w:rPr>
@@ -9784,7 +9784,7 @@
                 <w:szCs w:val="19"/>
                 <w:rtl w:val="0"/>
               </w:rPr>
-              <w:t xml:space="preserve">Toda mudanca gera registro imutavel em historico_situacao_veiculo (situacao anterior, nova, motivo, responsavel e data); ao passar para EM_PATIO, a localizacao no patio e obrigatoria. As transicoes nao sao bloqueadas pelo sistema: reverter DEVOLVIDO/DESCARTADO exige confirmacao e fica rastreada no historico.</w:t>
+              <w:t xml:space="preserve">Toda mudanca gera registro imutavel em historico_situacao_veiculo (situacao anterior, nova, motivo, responsavel e data). A propria situacao indica onde o veiculo se encontra (NA_DEPOL: na delegacia; EM_PATIO: no patio), sem controle de posicao interna no patio. As transicoes nao sao bloqueadas pelo sistema: reverter DEVOLVIDO/DESCARTADO exige confirmacao e fica rastreada no historico.</w:t>
             </w:r>
             <w:r>
               <w:rPr>
@@ -9880,7 +9880,7 @@
                 <w:szCs w:val="19"/>
                 <w:rtl w:val="0"/>
               </w:rPr>
-              <w:t xml:space="preserve">O sistema deve permitir que Delegado/Policial corrija dados descritivos do veiculo e atualize o status de pericia e a localizacao no patio.</w:t>
+              <w:t xml:space="preserve">O sistema deve permitir que Delegado/Policial corrija dados descritivos do veiculo e atualize o status de pericia.</w:t>
             </w:r>
             <w:r>
               <w:rPr>
@@ -17620,7 +17620,7 @@
           <w:vertAlign w:val="baseline"/>
           <w:rtl w:val="0"/>
         </w:rPr>
-        <w:t xml:space="preserve">Usuario escolhe a nova situacao (NA_DEPOL, EM_PATIO, DEVOLVIDO ou DESCARTADO) e informa o motivo; se a nova situacao for EM_PATIO, informa tambem a localizacao no patio.</w:t>
+        <w:t xml:space="preserve">Usuario escolhe a nova situacao (NA_DEPOL, EM_PATIO, DEVOLVIDO ou DESCARTADO) e informa o motivo.</w:t>
       </w:r>
       <w:r>
         <w:rPr>
@@ -17903,6 +17903,101 @@
     </w:p>
     <w:p>
       <w:pPr>
+        <w:spacing w:after="80" w:lineRule="auto"/>
+        <w:rPr/>
+      </w:pPr>
+      <w:r>
+        <w:rPr>
+          <w:b w:val="1"/>
+          <w:bCs w:val="1"/>
+          <w:rtl w:val="0"/>
+        </w:rPr>
+        <w:t xml:space="preserve">Pos-condicoes: </w:t>
+      </w:r>
+      <w:r>
+        <w:rPr>
+          <w:rtl w:val="0"/>
+        </w:rPr>
+        <w:t xml:space="preserve">Situacao do veiculo atualizada; historico anterior preservado (RNF12).</w:t>
+      </w:r>
+    </w:p>
+    <w:p>
+      <w:pPr>
+        <w:pStyle w:val="Heading2"/>
+        <w:spacing w:after="150" w:before="300" w:lineRule="auto"/>
+        <w:rPr>
+          <w:color w:val="000000"/>
+        </w:rPr>
+      </w:pPr>
+      <w:r>
+        <w:rPr>
+          <w:color w:val="000000"/>
+          <w:rtl w:val="0"/>
+        </w:rPr>
+        <w:t xml:space="preserve">UC20 - Consultar Veiculos Apreendidos (RF27)</w:t>
+      </w:r>
+    </w:p>
+    <w:p>
+      <w:pPr>
+        <w:spacing w:after="80" w:lineRule="auto"/>
+        <w:rPr/>
+      </w:pPr>
+      <w:r>
+        <w:rPr>
+          <w:b w:val="1"/>
+          <w:bCs w:val="1"/>
+          <w:rtl w:val="0"/>
+        </w:rPr>
+        <w:t xml:space="preserve">Ator(es): </w:t>
+      </w:r>
+      <w:r>
+        <w:rPr>
+          <w:rtl w:val="0"/>
+        </w:rPr>
+        <w:t xml:space="preserve">Delegado, Policial, Estagiario</w:t>
+      </w:r>
+    </w:p>
+    <w:p>
+      <w:pPr>
+        <w:spacing w:after="80" w:lineRule="auto"/>
+        <w:rPr/>
+      </w:pPr>
+      <w:r>
+        <w:rPr>
+          <w:b w:val="1"/>
+          <w:bCs w:val="1"/>
+          <w:rtl w:val="0"/>
+        </w:rPr>
+        <w:t xml:space="preserve">Pre-condicoes: </w:t>
+      </w:r>
+      <w:r>
+        <w:rPr>
+          <w:rtl w:val="0"/>
+        </w:rPr>
+        <w:t xml:space="preserve">Usuario autenticado.</w:t>
+      </w:r>
+    </w:p>
+    <w:p>
+      <w:pPr>
+        <w:spacing w:after="120" w:lineRule="auto"/>
+        <w:rPr/>
+      </w:pPr>
+      <w:r>
+        <w:rPr>
+          <w:b w:val="1"/>
+          <w:bCs w:val="1"/>
+          <w:rtl w:val="0"/>
+        </w:rPr>
+        <w:t xml:space="preserve">Fluxo principal:</w:t>
+      </w:r>
+      <w:r>
+        <w:rPr>
+          <w:rtl w:val="0"/>
+        </w:rPr>
+      </w:r>
+    </w:p>
+    <w:p>
+      <w:pPr>
         <w:keepNext w:val="0"/>
         <w:keepLines w:val="0"/>
         <w:pageBreakBefore w:val="0"/>
@@ -17940,102 +18035,7 @@
           <w:vertAlign w:val="baseline"/>
           <w:rtl w:val="0"/>
         </w:rPr>
-        <w:t xml:space="preserve">Nova situacao EM_PATIO sem localizacao no patio: sistema rejeita com mensagem de validacao.</w:t>
-      </w:r>
-      <w:r>
-        <w:rPr>
-          <w:rtl w:val="0"/>
-        </w:rPr>
-      </w:r>
-    </w:p>
-    <w:p>
-      <w:pPr>
-        <w:spacing w:after="80" w:lineRule="auto"/>
-        <w:rPr/>
-      </w:pPr>
-      <w:r>
-        <w:rPr>
-          <w:b w:val="1"/>
-          <w:bCs w:val="1"/>
-          <w:rtl w:val="0"/>
-        </w:rPr>
-        <w:t xml:space="preserve">Pos-condicoes: </w:t>
-      </w:r>
-      <w:r>
-        <w:rPr>
-          <w:rtl w:val="0"/>
-        </w:rPr>
-        <w:t xml:space="preserve">Situacao do veiculo atualizada; historico anterior preservado (RNF12).</w:t>
-      </w:r>
-    </w:p>
-    <w:p>
-      <w:pPr>
-        <w:pStyle w:val="Heading2"/>
-        <w:spacing w:after="150" w:before="300" w:lineRule="auto"/>
-        <w:rPr>
-          <w:color w:val="000000"/>
-        </w:rPr>
-      </w:pPr>
-      <w:r>
-        <w:rPr>
-          <w:color w:val="000000"/>
-          <w:rtl w:val="0"/>
-        </w:rPr>
-        <w:t xml:space="preserve">UC20 - Consultar Veiculos Apreendidos (RF27)</w:t>
-      </w:r>
-    </w:p>
-    <w:p>
-      <w:pPr>
-        <w:spacing w:after="80" w:lineRule="auto"/>
-        <w:rPr/>
-      </w:pPr>
-      <w:r>
-        <w:rPr>
-          <w:b w:val="1"/>
-          <w:bCs w:val="1"/>
-          <w:rtl w:val="0"/>
-        </w:rPr>
-        <w:t xml:space="preserve">Ator(es): </w:t>
-      </w:r>
-      <w:r>
-        <w:rPr>
-          <w:rtl w:val="0"/>
-        </w:rPr>
-        <w:t xml:space="preserve">Delegado, Policial, Estagiario</w:t>
-      </w:r>
-    </w:p>
-    <w:p>
-      <w:pPr>
-        <w:spacing w:after="80" w:lineRule="auto"/>
-        <w:rPr/>
-      </w:pPr>
-      <w:r>
-        <w:rPr>
-          <w:b w:val="1"/>
-          <w:bCs w:val="1"/>
-          <w:rtl w:val="0"/>
-        </w:rPr>
-        <w:t xml:space="preserve">Pre-condicoes: </w:t>
-      </w:r>
-      <w:r>
-        <w:rPr>
-          <w:rtl w:val="0"/>
-        </w:rPr>
-        <w:t xml:space="preserve">Usuario autenticado.</w:t>
-      </w:r>
-    </w:p>
-    <w:p>
-      <w:pPr>
-        <w:spacing w:after="120" w:lineRule="auto"/>
-        <w:rPr/>
-      </w:pPr>
-      <w:r>
-        <w:rPr>
-          <w:b w:val="1"/>
-          <w:bCs w:val="1"/>
-          <w:rtl w:val="0"/>
-        </w:rPr>
-        <w:t xml:space="preserve">Fluxo principal:</w:t>
+        <w:t xml:space="preserve">Usuario acessa a listagem de veiculos.</w:t>
       </w:r>
       <w:r>
         <w:rPr>
@@ -18082,7 +18082,7 @@
           <w:vertAlign w:val="baseline"/>
           <w:rtl w:val="0"/>
         </w:rPr>
-        <w:t xml:space="preserve">Usuario acessa a listagem de veiculos.</w:t>
+        <w:t xml:space="preserve">Usuario aplica filtros (lacre, placa, chassi, situacao, procedimento) - opcional.</w:t>
       </w:r>
       <w:r>
         <w:rPr>
@@ -18129,53 +18129,6 @@
           <w:vertAlign w:val="baseline"/>
           <w:rtl w:val="0"/>
         </w:rPr>
-        <w:t xml:space="preserve">Usuario aplica filtros (lacre, placa, chassi, situacao, procedimento) - opcional.</w:t>
-      </w:r>
-      <w:r>
-        <w:rPr>
-          <w:rtl w:val="0"/>
-        </w:rPr>
-      </w:r>
-    </w:p>
-    <w:p>
-      <w:pPr>
-        <w:keepNext w:val="0"/>
-        <w:keepLines w:val="0"/>
-        <w:pageBreakBefore w:val="0"/>
-        <w:widowControl w:val="1"/>
-        <w:numPr>
-          <w:ilvl w:val="0"/>
-          <w:numId w:val="1"/>
-        </w:numPr>
-        <w:pBdr>
-          <w:top w:space="0" w:sz="0" w:val="nil"/>
-          <w:left w:space="0" w:sz="0" w:val="nil"/>
-          <w:bottom w:space="0" w:sz="0" w:val="nil"/>
-          <w:right w:space="0" w:sz="0" w:val="nil"/>
-          <w:between w:space="0" w:sz="0" w:val="nil"/>
-        </w:pBdr>
-        <w:shd w:fill="auto" w:val="clear"/>
-        <w:spacing w:after="60" w:before="0" w:line="240" w:lineRule="auto"/>
-        <w:ind w:left="720" w:right="0" w:hanging="360"/>
-        <w:jc w:val="left"/>
-        <w:rPr/>
-      </w:pPr>
-      <w:r>
-        <w:rPr>
-          <w:rFonts w:ascii="Times New Roman" w:cs="Times New Roman" w:eastAsia="Times New Roman" w:hAnsi="Times New Roman"/>
-          <w:b w:val="0"/>
-          <w:bCs w:val="0"/>
-          <w:i w:val="0"/>
-          <w:iCs w:val="0"/>
-          <w:smallCaps w:val="0"/>
-          <w:strike w:val="0"/>
-          <w:sz w:val="20"/>
-          <w:szCs w:val="20"/>
-          <w:u w:val="none"/>
-          <w:shd w:fill="auto" w:val="clear"/>
-          <w:vertAlign w:val="baseline"/>
-          <w:rtl w:val="0"/>
-        </w:rPr>
         <w:t xml:space="preserve">Usuario seleciona um veiculo e visualiza seus dados e o historico de situacoes.</w:t>
       </w:r>
       <w:r>
@@ -18357,7 +18310,7 @@
         <w:rPr>
           <w:rtl w:val="0"/>
         </w:rPr>
-        <w:t xml:space="preserve">Delegado/Policial corrige dados descritivos do veiculo, atualiza o status de pericia (SEM_PERICIA, PERICIA_EM_ANDAMENTO, PERICIA_CONCLUIDA, NAO_PRECISA_PERICIA) ou a localizacao no patio (quando EM_PATIO). Excecao: o lacre e somente leitura e nao pode ser alterado.</w:t>
+        <w:t xml:space="preserve">Delegado/Policial corrige dados descritivos do veiculo, atualiza o status de pericia (SEM_PERICIA, PERICIA_EM_ANDAMENTO, PERICIA_CONCLUIDA, NAO_PRECISA_PERICIA). Excecao: o lacre e somente leitura e nao pode ser alterado.</w:t>
       </w:r>
     </w:p>
     <w:p>

</xml_diff>

<commit_message>
docs: UC03 com motivo de rejeição exibido no login e pacotes por domínio
- UC03/RF03: rejeição exige motivo, mostrado ao solicitante na tentativa de
  login (o rejeitado não acessa o sistema, então não há notificação)
- CLAUDE.md: estrutura de pacotes após o refactor por domínio, campo
  motivoRejeicao em Usuario e regras de cadastro/aprovação

Co-Authored-By: Claude Opus 5.5 <noreply@anthropic.com>
Claude-Session: https://claude.ai/code/session_01GMFoBKNCA64LGtSS3QvF5S
</commit_message>
<xml_diff>
--- a/docs/Sistema_Delegacia_v2_Documentacao_SGI-DP.docx
+++ b/docs/Sistema_Delegacia_v2_Documentacao_SGI-DP.docx
@@ -5692,7 +5692,7 @@
                 <w:szCs w:val="19"/>
                 <w:rtl w:val="0"/>
               </w:rPr>
-              <w:t xml:space="preserve">-</w:t>
+              <w:t>Rejeicao exige motivo, exibido ao solicitante no login.</w:t>
             </w:r>
             <w:r>
               <w:rPr>
@@ -13517,7 +13517,7 @@
           <w:vertAlign w:val="baseline"/>
           <w:rtl w:val="0"/>
         </w:rPr>
-        <w:t xml:space="preserve">Admin rejeita o cadastro, informando motivo.</w:t>
+        <w:t>Admin rejeita o cadastro, informando motivo (obrigatorio).</w:t>
       </w:r>
       <w:r>
         <w:rPr>
@@ -13564,7 +13564,7 @@
           <w:vertAlign w:val="baseline"/>
           <w:rtl w:val="0"/>
         </w:rPr>
-        <w:t xml:space="preserve">Sistema atualiza status para "rejeitado" e notifica o solicitante com o motivo.</w:t>
+        <w:t>Sistema atualiza status para "rejeitado" e registra o motivo; como o usuario rejeitado nao acessa o sistema, o motivo e exibido a ele na tentativa de login (UC01), em vez de notificacao.</w:t>
       </w:r>
       <w:r>
         <w:rPr>
@@ -13589,7 +13589,7 @@
         <w:rPr>
           <w:rtl w:val="0"/>
         </w:rPr>
-        <w:t xml:space="preserve">Usuario com status definitivo (aprovado/rejeitado); se aprovado, pode executar UC01.</w:t>
+        <w:t>Usuario com status definitivo (aprovado/rejeitado); se aprovado, pode executar UC01. Login e matricula de cadastro rejeitado permanecem reservados (sem novo cadastro com os mesmos dados).</w:t>
       </w:r>
     </w:p>
     <w:p>

</xml_diff>

<commit_message>
docs: limitação do token após desativação e regras da gestão (UC13/UC14)
- docx: revogação imediata de acesso listada em 'Fase posterior'
- CLAUDE.md: limitação detalhada, regras de gestão de usuários e nova seção
  'Melhorias futuras'

Co-Authored-By: Claude Opus 5.5 <noreply@anthropic.com>
Claude-Session: https://claude.ai/code/session_01GMFoBKNCA64LGtSS3QvF5S
</commit_message>
<xml_diff>
--- a/docs/Sistema_Delegacia_v2_Documentacao_SGI-DP.docx
+++ b/docs/Sistema_Delegacia_v2_Documentacao_SGI-DP.docx
@@ -2946,6 +2946,51 @@
         <w:rPr>
           <w:rtl w:val="0"/>
         </w:rPr>
+      </w:r>
+    </w:p>
+    <w:p>
+      <w:pPr>
+        <w:keepNext w:val="0"/>
+        <w:keepLines w:val="0"/>
+        <w:pageBreakBefore w:val="0"/>
+        <w:widowControl w:val="1"/>
+        <w:numPr>
+          <w:ilvl w:val="0"/>
+          <w:numId w:val="1"/>
+        </w:numPr>
+        <w:pBdr>
+          <w:top w:space="0" w:sz="0" w:val="nil"/>
+          <w:left w:space="0" w:sz="0" w:val="nil"/>
+          <w:bottom w:space="0" w:sz="0" w:val="nil"/>
+          <w:right w:space="0" w:sz="0" w:val="nil"/>
+          <w:between w:space="0" w:sz="0" w:val="nil"/>
+        </w:pBdr>
+        <w:shd w:fill="auto" w:val="clear"/>
+        <w:spacing w:after="60" w:before="0" w:line="240" w:lineRule="auto"/>
+        <w:ind w:left="720" w:right="0" w:hanging="360"/>
+        <w:jc w:val="both"/>
+        <w:rPr>
+          <w:sz w:val="24"/>
+          <w:szCs w:val="24"/>
+        </w:rPr>
+      </w:pPr>
+      <w:r>
+        <w:rPr>
+          <w:rFonts w:ascii="Times New Roman" w:cs="Times New Roman" w:eastAsia="Times New Roman" w:hAnsi="Times New Roman"/>
+          <w:b w:val="0"/>
+          <w:bCs w:val="0"/>
+          <w:i w:val="0"/>
+          <w:iCs w:val="0"/>
+          <w:smallCaps w:val="0"/>
+          <w:strike w:val="0"/>
+          <w:sz w:val="24"/>
+          <w:szCs w:val="24"/>
+          <w:u w:val="none"/>
+          <w:shd w:fill="auto" w:val="clear"/>
+          <w:vertAlign w:val="baseline"/>
+          <w:rtl w:val="0"/>
+        </w:rPr>
+        <w:t>Revogação imediata de acesso: hoje o token JWT continua válido até expirar (8h) mesmo após o usuário ser desativado, permitindo ações nesse intervalo (inclusive reativar a si mesmo). Evolução: conferir o status do usuário a cada requisição (ou lista de tokens revogados).</w:t>
       </w:r>
     </w:p>
     <w:p>

</xml_diff>

<commit_message>
docs: contrato e decisões do módulo de veículos; Envers como melhoria futura
- CLAUDE.md: rotas de veículos, permissões, procedimento arquivado aceita
  veículo, confirmações com flag + 409, histórico desde o cadastro, PUT sem
  troca de vínculo (RF26)
- Melhorias futuras: rastreabilidade completa do veículo e auditoria com
  Hibernate Envers (também na seção 'Fase posterior' do docx)
- UC18: pré-condição aceita procedimento em andamento ou arquivado

Co-Authored-By: Claude Opus 5.5 <noreply@anthropic.com>
Claude-Session: https://claude.ai/code/session_01GMFoBKNCA64LGtSS3QvF5S
</commit_message>
<xml_diff>
--- a/docs/Sistema_Delegacia_v2_Documentacao_SGI-DP.docx
+++ b/docs/Sistema_Delegacia_v2_Documentacao_SGI-DP.docx
@@ -2991,6 +2991,96 @@
           <w:rtl w:val="0"/>
         </w:rPr>
         <w:t>Revogação imediata de acesso: hoje o token JWT continua válido até expirar (8h) mesmo após o usuário ser desativado, permitindo ações nesse intervalo (inclusive reativar a si mesmo). Evolução: conferir o status do usuário a cada requisição (ou lista de tokens revogados).</w:t>
+      </w:r>
+    </w:p>
+    <w:p>
+      <w:pPr>
+        <w:keepNext w:val="0"/>
+        <w:keepLines w:val="0"/>
+        <w:pageBreakBefore w:val="0"/>
+        <w:widowControl w:val="1"/>
+        <w:numPr>
+          <w:ilvl w:val="0"/>
+          <w:numId w:val="1"/>
+        </w:numPr>
+        <w:pBdr>
+          <w:top w:space="0" w:sz="0" w:val="nil"/>
+          <w:left w:space="0" w:sz="0" w:val="nil"/>
+          <w:bottom w:space="0" w:sz="0" w:val="nil"/>
+          <w:right w:space="0" w:sz="0" w:val="nil"/>
+          <w:between w:space="0" w:sz="0" w:val="nil"/>
+        </w:pBdr>
+        <w:shd w:fill="auto" w:val="clear"/>
+        <w:spacing w:after="60" w:before="0" w:line="240" w:lineRule="auto"/>
+        <w:ind w:left="720" w:right="0" w:hanging="360"/>
+        <w:jc w:val="both"/>
+        <w:rPr>
+          <w:sz w:val="24"/>
+          <w:szCs w:val="24"/>
+        </w:rPr>
+      </w:pPr>
+      <w:r>
+        <w:rPr>
+          <w:rFonts w:ascii="Times New Roman" w:cs="Times New Roman" w:eastAsia="Times New Roman" w:hAnsi="Times New Roman"/>
+          <w:b w:val="0"/>
+          <w:bCs w:val="0"/>
+          <w:i w:val="0"/>
+          <w:iCs w:val="0"/>
+          <w:smallCaps w:val="0"/>
+          <w:strike w:val="0"/>
+          <w:sz w:val="24"/>
+          <w:szCs w:val="24"/>
+          <w:u w:val="none"/>
+          <w:shd w:fill="auto" w:val="clear"/>
+          <w:vertAlign w:val="baseline"/>
+          <w:rtl w:val="0"/>
+        </w:rPr>
+        <w:t>Rastreabilidade completa do veículo: troca do procedimento vinculado com motivo e histórico próprio, e registro das edições de dados (placa, chassi, perícia). No MVP, apenas as mudanças de situação são rastreadas e a edição (RF26) não altera o vínculo.</w:t>
+      </w:r>
+    </w:p>
+    <w:p>
+      <w:pPr>
+        <w:keepNext w:val="0"/>
+        <w:keepLines w:val="0"/>
+        <w:pageBreakBefore w:val="0"/>
+        <w:widowControl w:val="1"/>
+        <w:numPr>
+          <w:ilvl w:val="0"/>
+          <w:numId w:val="1"/>
+        </w:numPr>
+        <w:pBdr>
+          <w:top w:space="0" w:sz="0" w:val="nil"/>
+          <w:left w:space="0" w:sz="0" w:val="nil"/>
+          <w:bottom w:space="0" w:sz="0" w:val="nil"/>
+          <w:right w:space="0" w:sz="0" w:val="nil"/>
+          <w:between w:space="0" w:sz="0" w:val="nil"/>
+        </w:pBdr>
+        <w:shd w:fill="auto" w:val="clear"/>
+        <w:spacing w:after="60" w:before="0" w:line="240" w:lineRule="auto"/>
+        <w:ind w:left="720" w:right="0" w:hanging="360"/>
+        <w:jc w:val="both"/>
+        <w:rPr>
+          <w:sz w:val="24"/>
+          <w:szCs w:val="24"/>
+        </w:rPr>
+      </w:pPr>
+      <w:r>
+        <w:rPr>
+          <w:rFonts w:ascii="Times New Roman" w:cs="Times New Roman" w:eastAsia="Times New Roman" w:hAnsi="Times New Roman"/>
+          <w:b w:val="0"/>
+          <w:bCs w:val="0"/>
+          <w:i w:val="0"/>
+          <w:iCs w:val="0"/>
+          <w:smallCaps w:val="0"/>
+          <w:strike w:val="0"/>
+          <w:sz w:val="24"/>
+          <w:szCs w:val="24"/>
+          <w:u w:val="none"/>
+          <w:shd w:fill="auto" w:val="clear"/>
+          <w:vertAlign w:val="baseline"/>
+          <w:rtl w:val="0"/>
+        </w:rPr>
+        <w:t>Auditoria técnica com Hibernate Envers: versões de todas as alterações das entidades (o quê, quando e por quem), complementando os históricos de negócio, que registram o motivo.</w:t>
       </w:r>
     </w:p>
     <w:p>
@@ -17114,7 +17204,7 @@
         <w:rPr>
           <w:rtl w:val="0"/>
         </w:rPr>
-        <w:t xml:space="preserve">Usuario autenticado; existe o procedimento ao qual o veiculo sera vinculado.</w:t>
+        <w:t>Usuario autenticado; existe o procedimento ao qual o veiculo sera vinculado (em andamento ou arquivado: o arquivamento encerra as diligencias, nao a destinacao do veiculo).</w:t>
       </w:r>
     </w:p>
     <w:p>

</xml_diff>